<commit_message>
Improved sub-folder naming conventions
</commit_message>
<xml_diff>
--- a/PIGDE - Group 8 - Assessment 1 Part B - Realm/3. Research documents/RESEARCH - Pressure points.docx
+++ b/PIGDE - Group 8 - Assessment 1 Part B - Realm/3. Research documents/RESEARCH - Pressure points.docx
@@ -11,28 +11,9 @@
       <w:r>
         <w:t>ACADEMIC RESEARCH (REALM SPECIFIC)</w:t>
       </w:r>
-    </w:p>
-    <w:p>
-      <w:pPr>
-        <w:rPr>
-          <w:b/>
-          <w:bCs/>
-          <w:u w:val="single"/>
-        </w:rPr>
-      </w:pPr>
-    </w:p>
-    <w:p>
-      <w:pPr>
-        <w:pStyle w:val="Heading1"/>
-      </w:pPr>
       <w:bookmarkStart w:id="1" w:name="_1769nniwgxlo" w:colFirst="0" w:colLast="0"/>
+      <w:bookmarkStart w:id="2" w:name="_kjiwii3at1fz" w:colFirst="0" w:colLast="0"/>
       <w:bookmarkEnd w:id="1"/>
-    </w:p>
-    <w:p>
-      <w:pPr>
-        <w:pStyle w:val="Heading1"/>
-      </w:pPr>
-      <w:bookmarkStart w:id="2" w:name="_kjiwii3at1fz" w:colFirst="0" w:colLast="0"/>
       <w:bookmarkEnd w:id="2"/>
     </w:p>
     <w:p>
@@ -291,14 +272,26 @@
         </w:rPr>
       </w:pPr>
       <w:r>
-        <w:t xml:space="preserve">1.3)  </w:t>
-      </w:r>
-      <w:r>
-        <w:rPr>
-          <w:b/>
-          <w:bCs/>
-        </w:rPr>
-        <w:t>Helps balance player skill differences:</w:t>
+        <w:t>1.3</w:t>
+      </w:r>
+      <w:proofErr w:type="gramStart"/>
+      <w:r>
+        <w:t xml:space="preserve">)  </w:t>
+      </w:r>
+      <w:r>
+        <w:rPr>
+          <w:b/>
+          <w:bCs/>
+        </w:rPr>
+        <w:t>Helps</w:t>
+      </w:r>
+      <w:proofErr w:type="gramEnd"/>
+      <w:r>
+        <w:rPr>
+          <w:b/>
+          <w:bCs/>
+        </w:rPr>
+        <w:t xml:space="preserve"> balance player skill differences:</w:t>
       </w:r>
     </w:p>
     <w:p>
@@ -613,10 +606,22 @@
           <w:b/>
           <w:bCs/>
         </w:rPr>
-        <w:t xml:space="preserve">“Resource management/tracking” </w:t>
-      </w:r>
-      <w:r>
-        <w:t xml:space="preserve"> in a PvP style board game:</w:t>
+        <w:t>“Resource management/</w:t>
+      </w:r>
+      <w:proofErr w:type="gramStart"/>
+      <w:r>
+        <w:rPr>
+          <w:b/>
+          <w:bCs/>
+        </w:rPr>
+        <w:t xml:space="preserve">tracking” </w:t>
+      </w:r>
+      <w:r>
+        <w:t xml:space="preserve"> in</w:t>
+      </w:r>
+      <w:proofErr w:type="gramEnd"/>
+      <w:r>
+        <w:t xml:space="preserve"> a PvP style board game:</w:t>
       </w:r>
     </w:p>
     <w:p/>
@@ -704,7 +709,15 @@
         <w:ind w:left="720"/>
       </w:pPr>
       <w:r>
-        <w:t>Tracking resources can prevent players gaining an unfair advantage and give them an upper hand over others  and prevent players from making mistakes that unintentionally break the mechanics of a game. This is critical in a PvP style board game as equal competition is key to a competitive situation(s)</w:t>
+        <w:t xml:space="preserve">Tracking resources can prevent players gaining an unfair advantage and give them an upper hand over </w:t>
+      </w:r>
+      <w:proofErr w:type="gramStart"/>
+      <w:r>
+        <w:t>others  and</w:t>
+      </w:r>
+      <w:proofErr w:type="gramEnd"/>
+      <w:r>
+        <w:t xml:space="preserve"> prevent players from making mistakes that unintentionally break the mechanics of a game. This is critical in a PvP style board game as equal competition is key to a competitive situation(s)</w:t>
       </w:r>
     </w:p>
     <w:p>

</xml_diff>

<commit_message>
Update RESEARCH - Pressure points.docx
</commit_message>
<xml_diff>
--- a/PIGDE - Group 8 - Assessment 1 Part B - Realm/3. Research documents/RESEARCH - Pressure points.docx
+++ b/PIGDE - Group 8 - Assessment 1 Part B - Realm/3. Research documents/RESEARCH - Pressure points.docx
@@ -820,18 +820,289 @@
       </w:pPr>
       <w:bookmarkStart w:id="8" w:name="_52cvvw14rgbj" w:colFirst="0" w:colLast="0"/>
       <w:bookmarkEnd w:id="8"/>
-    </w:p>
-    <w:p/>
-    <w:p/>
-    <w:p/>
+      <w:r>
+        <w:lastRenderedPageBreak/>
+        <w:t xml:space="preserve">4. How can </w:t>
+      </w:r>
+      <w:r>
+        <w:rPr>
+          <w:b/>
+          <w:bCs/>
+        </w:rPr>
+        <w:t>Player vs Player interactions</w:t>
+      </w:r>
+      <w:r>
+        <w:t xml:space="preserve"> be improved when other win conditions are more accessible to players? </w:t>
+      </w:r>
+    </w:p>
+    <w:p/>
+    <w:p>
+      <w:r>
+        <w:t>4.1)</w:t>
+      </w:r>
+      <w:r>
+        <w:rPr>
+          <w:b/>
+          <w:bCs/>
+        </w:rPr>
+        <w:t xml:space="preserve"> Balancing competitive encouragement to help cultivate social dynamics:</w:t>
+      </w:r>
+    </w:p>
+    <w:p>
+      <w:pPr>
+        <w:ind w:left="720"/>
+      </w:pPr>
+      <w:r>
+        <w:t>Games should include rewards for encouraging social communication and planning such as negotiated agreements, which can help change how players engage socially and physically during a game.</w:t>
+      </w:r>
+    </w:p>
+    <w:p/>
+    <w:p>
+      <w:pPr>
+        <w:rPr>
+          <w:b/>
+          <w:bCs/>
+        </w:rPr>
+      </w:pPr>
+      <w:r>
+        <w:t>4.2</w:t>
+      </w:r>
+      <w:proofErr w:type="gramStart"/>
+      <w:r>
+        <w:t xml:space="preserve">) </w:t>
+      </w:r>
+      <w:r>
+        <w:rPr>
+          <w:b/>
+          <w:bCs/>
+        </w:rPr>
+        <w:t xml:space="preserve"> Using</w:t>
+      </w:r>
+      <w:proofErr w:type="gramEnd"/>
+      <w:r>
+        <w:rPr>
+          <w:b/>
+          <w:bCs/>
+        </w:rPr>
+        <w:t xml:space="preserve"> reward and incentive systems to make attacking worthwhile:</w:t>
+      </w:r>
+    </w:p>
+    <w:p>
+      <w:pPr>
+        <w:ind w:left="720"/>
+      </w:pPr>
+      <w:r>
+        <w:t>Designing reward structures that specifically reinforce aggressive or interaction-focused actions can change player behaviour. Academic research shows that different incentive frames (rewards) influence whether players help, hinder, or interact positively or negatively. When rewards are tied to interaction, players are more likely to engage with those mechanics.</w:t>
+      </w:r>
+    </w:p>
+    <w:p/>
+    <w:p>
+      <w:pPr>
+        <w:rPr>
+          <w:b/>
+          <w:bCs/>
+        </w:rPr>
+      </w:pPr>
+      <w:r>
+        <w:t xml:space="preserve">4.3) </w:t>
+      </w:r>
+      <w:r>
+        <w:rPr>
+          <w:b/>
+          <w:bCs/>
+        </w:rPr>
+        <w:t>Balance rewards for aggressive actions with counter-play benefits</w:t>
+      </w:r>
+    </w:p>
+    <w:p>
+      <w:pPr>
+        <w:ind w:left="720"/>
+      </w:pPr>
+      <w:r>
+        <w:t>If attacking doesn’t give a clear advantage, players will avoid it. Research on game balance and engagement shows that properly calibrated rewards (and punishments) help keep competitive interactions engaging, fair, and motivating rather than avoided.</w:t>
+      </w:r>
+    </w:p>
+    <w:p/>
+    <w:p/>
+    <w:p>
+      <w:r>
+        <w:tab/>
+      </w:r>
+    </w:p>
     <w:p/>
     <w:p/>
     <w:p>
       <w:pPr>
         <w:pStyle w:val="Heading1"/>
       </w:pPr>
-      <w:bookmarkStart w:id="9" w:name="_hy0d2rmhdwan" w:colFirst="0" w:colLast="0"/>
+      <w:bookmarkStart w:id="9" w:name="_uxjvtt8z9qgl" w:colFirst="0" w:colLast="0"/>
       <w:bookmarkEnd w:id="9"/>
+      <w:r>
+        <w:t xml:space="preserve">5. How to improve </w:t>
+      </w:r>
+      <w:r>
+        <w:rPr>
+          <w:b/>
+          <w:bCs/>
+        </w:rPr>
+        <w:t xml:space="preserve">Resource Management </w:t>
+      </w:r>
+      <w:r>
+        <w:t>in a PvP board game</w:t>
+      </w:r>
+    </w:p>
+    <w:p>
+      <w:pPr>
+        <w:rPr>
+          <w:b/>
+          <w:bCs/>
+        </w:rPr>
+      </w:pPr>
+      <w:r>
+        <w:t xml:space="preserve">5.1) </w:t>
+      </w:r>
+      <w:r>
+        <w:rPr>
+          <w:b/>
+          <w:bCs/>
+        </w:rPr>
+        <w:t>Encourage a balance between short‑term and long‑term planning:</w:t>
+      </w:r>
+    </w:p>
+    <w:p>
+      <w:pPr>
+        <w:ind w:left="720"/>
+      </w:pPr>
+      <w:r>
+        <w:t>Studies examining how players manage resources in sustainability games indicate that players initially focus on immediate gains but shift toward long‑term cooperation and strategic planning when the game design supports future‑focused decision making. These findings suggest that resource systems should make both short‑term and long‑term strategies meaningful to avoid reckless spending.</w:t>
+      </w:r>
+    </w:p>
+    <w:p/>
+    <w:p>
+      <w:pPr>
+        <w:rPr>
+          <w:b/>
+          <w:bCs/>
+        </w:rPr>
+      </w:pPr>
+      <w:r>
+        <w:t xml:space="preserve">5.2) </w:t>
+      </w:r>
+      <w:r>
+        <w:rPr>
+          <w:b/>
+          <w:bCs/>
+        </w:rPr>
+        <w:t>Structure resource choices to support systems thinking:</w:t>
+      </w:r>
+    </w:p>
+    <w:p>
+      <w:pPr>
+        <w:ind w:left="720"/>
+      </w:pPr>
+      <w:r>
+        <w:t>Research on game mechanics for sustainability and resource strategies suggests that resource decisions should reflect broader game system interactions rather than isolated actions. When players see how their resource choices affect interconnected systems, they make more thoughtful decisions that improve strategic depth.</w:t>
+      </w:r>
+    </w:p>
+    <w:p>
+      <w:pPr>
+        <w:rPr>
+          <w:b/>
+          <w:bCs/>
+        </w:rPr>
+      </w:pPr>
+    </w:p>
+    <w:p>
+      <w:pPr>
+        <w:rPr>
+          <w:b/>
+          <w:bCs/>
+        </w:rPr>
+      </w:pPr>
+    </w:p>
+    <w:p>
+      <w:pPr>
+        <w:pStyle w:val="Heading1"/>
+        <w:rPr>
+          <w:b/>
+          <w:bCs/>
+        </w:rPr>
+      </w:pPr>
+      <w:bookmarkStart w:id="10" w:name="_rglai0luuogb" w:colFirst="0" w:colLast="0"/>
+      <w:bookmarkEnd w:id="10"/>
+      <w:r>
+        <w:lastRenderedPageBreak/>
+        <w:t xml:space="preserve">6. How can a PvP board game be </w:t>
+      </w:r>
+      <w:r>
+        <w:rPr>
+          <w:b/>
+          <w:bCs/>
+        </w:rPr>
+        <w:t>more accessible?</w:t>
+      </w:r>
+    </w:p>
+    <w:p>
+      <w:r>
+        <w:t>6.1)</w:t>
+      </w:r>
+      <w:r>
+        <w:rPr>
+          <w:b/>
+          <w:bCs/>
+        </w:rPr>
+        <w:t xml:space="preserve"> Implementing </w:t>
+      </w:r>
+      <w:proofErr w:type="gramStart"/>
+      <w:r>
+        <w:rPr>
+          <w:b/>
+          <w:bCs/>
+        </w:rPr>
+        <w:t>high-contrast</w:t>
+      </w:r>
+      <w:proofErr w:type="gramEnd"/>
+      <w:r>
+        <w:rPr>
+          <w:b/>
+          <w:bCs/>
+        </w:rPr>
+        <w:t xml:space="preserve"> for a more readable design:</w:t>
+      </w:r>
+      <w:r>
+        <w:t>​</w:t>
+      </w:r>
+    </w:p>
+    <w:p>
+      <w:pPr>
+        <w:ind w:left="720"/>
+      </w:pPr>
+      <w:r>
+        <w:t>By providing high-contrast colour schemes and simple design can help improve the visual clarity to players, which can improve acknowledgement for players to help support their understanding of the game when going into the mid – late game phase.​</w:t>
+      </w:r>
+    </w:p>
+    <w:p/>
+    <w:p/>
+    <w:p>
+      <w:pPr>
+        <w:pStyle w:val="Heading1"/>
+      </w:pPr>
+      <w:bookmarkStart w:id="11" w:name="_4wia8enqb2of" w:colFirst="0" w:colLast="0"/>
+      <w:bookmarkEnd w:id="11"/>
+    </w:p>
+    <w:p>
+      <w:pPr>
+        <w:pStyle w:val="Heading1"/>
+      </w:pPr>
+      <w:bookmarkStart w:id="12" w:name="_k803m81zmcm" w:colFirst="0" w:colLast="0"/>
+      <w:bookmarkEnd w:id="12"/>
+    </w:p>
+    <w:p>
+      <w:pPr>
+        <w:pStyle w:val="Heading1"/>
+      </w:pPr>
+      <w:bookmarkStart w:id="13" w:name="_hy0d2rmhdwan" w:colFirst="0" w:colLast="0"/>
+      <w:bookmarkEnd w:id="13"/>
       <w:r>
         <w:t>CITATIONS/REFERENCES:</w:t>
       </w:r>
@@ -1111,6 +1382,7 @@
           <w:b/>
           <w:bCs/>
         </w:rPr>
+        <w:lastRenderedPageBreak/>
         <w:t xml:space="preserve">3.3) </w:t>
       </w:r>
       <w:proofErr w:type="spellStart"/>
@@ -1143,6 +1415,332 @@
           <w:t>https://www.cs.northwestern.edu/~hunicke/MDA.pdf</w:t>
         </w:r>
       </w:hyperlink>
+    </w:p>
+    <w:p/>
+    <w:p>
+      <w:r>
+        <w:t xml:space="preserve">4.1) </w:t>
+      </w:r>
+      <w:r>
+        <w:rPr>
+          <w:b/>
+          <w:bCs/>
+        </w:rPr>
+        <w:t>Gomes, S., Martinho, C., &amp; Dias, J. (2018, November 17).</w:t>
+      </w:r>
+      <w:r>
+        <w:t xml:space="preserve"> </w:t>
+      </w:r>
+      <w:r>
+        <w:rPr>
+          <w:i/>
+          <w:iCs/>
+        </w:rPr>
+        <w:t xml:space="preserve">Dynamic social interaction mechanics </w:t>
+      </w:r>
+      <w:proofErr w:type="spellStart"/>
+      <w:r>
+        <w:rPr>
+          <w:i/>
+          <w:iCs/>
+        </w:rPr>
+        <w:t>CrossAnt</w:t>
+      </w:r>
+      <w:proofErr w:type="spellEnd"/>
+      <w:r>
+        <w:t xml:space="preserve"> (arXiv:1811.07243). </w:t>
+      </w:r>
+      <w:proofErr w:type="spellStart"/>
+      <w:r>
+        <w:t>arXiv</w:t>
+      </w:r>
+      <w:proofErr w:type="spellEnd"/>
+      <w:r>
+        <w:t>.</w:t>
+      </w:r>
+      <w:hyperlink r:id="rId11">
+        <w:r>
+          <w:t xml:space="preserve"> </w:t>
+        </w:r>
+      </w:hyperlink>
+      <w:hyperlink r:id="rId12">
+        <w:r>
+          <w:rPr>
+            <w:color w:val="1155CC"/>
+            <w:u w:val="single"/>
+          </w:rPr>
+          <w:t>https://arxiv.org/abs/1811.07243</w:t>
+        </w:r>
+      </w:hyperlink>
+    </w:p>
+    <w:p/>
+    <w:p>
+      <w:r>
+        <w:t xml:space="preserve">4.2) </w:t>
+      </w:r>
+      <w:r>
+        <w:rPr>
+          <w:b/>
+          <w:bCs/>
+        </w:rPr>
+        <w:t>Gomes, S., Martinho, C., &amp; Dias, J. (2020).</w:t>
+      </w:r>
+      <w:r>
+        <w:t xml:space="preserve"> </w:t>
+      </w:r>
+      <w:r>
+        <w:rPr>
+          <w:i/>
+          <w:iCs/>
+        </w:rPr>
+        <w:t xml:space="preserve">Dynamic social interaction mechanics </w:t>
+      </w:r>
+      <w:proofErr w:type="spellStart"/>
+      <w:r>
+        <w:rPr>
+          <w:i/>
+          <w:iCs/>
+        </w:rPr>
+        <w:t>CrossAnt</w:t>
+      </w:r>
+      <w:proofErr w:type="spellEnd"/>
+      <w:r>
+        <w:rPr>
+          <w:i/>
+          <w:iCs/>
+        </w:rPr>
+        <w:t>.</w:t>
+      </w:r>
+      <w:r>
+        <w:t xml:space="preserve"> </w:t>
+      </w:r>
+      <w:proofErr w:type="spellStart"/>
+      <w:r>
+        <w:t>arXiv</w:t>
+      </w:r>
+      <w:proofErr w:type="spellEnd"/>
+      <w:r>
+        <w:t>.</w:t>
+      </w:r>
+      <w:hyperlink r:id="rId13">
+        <w:r>
+          <w:t xml:space="preserve"> </w:t>
+        </w:r>
+      </w:hyperlink>
+      <w:hyperlink r:id="rId14">
+        <w:r>
+          <w:rPr>
+            <w:color w:val="1155CC"/>
+            <w:u w:val="single"/>
+          </w:rPr>
+          <w:t>https://arxiv.org/abs/2003.12604</w:t>
+        </w:r>
+      </w:hyperlink>
+    </w:p>
+    <w:p/>
+    <w:p>
+      <w:r>
+        <w:t>4.3)</w:t>
+      </w:r>
+      <w:r>
+        <w:rPr>
+          <w:b/>
+          <w:bCs/>
+        </w:rPr>
+        <w:t xml:space="preserve"> </w:t>
+      </w:r>
+      <w:proofErr w:type="spellStart"/>
+      <w:r>
+        <w:rPr>
+          <w:b/>
+          <w:bCs/>
+        </w:rPr>
+        <w:t>Altimira</w:t>
+      </w:r>
+      <w:proofErr w:type="spellEnd"/>
+      <w:r>
+        <w:rPr>
+          <w:b/>
+          <w:bCs/>
+        </w:rPr>
+        <w:t>, D., &amp; Mueller, F. (2017)</w:t>
+      </w:r>
+      <w:r>
+        <w:t xml:space="preserve">. </w:t>
+      </w:r>
+      <w:r>
+        <w:rPr>
+          <w:i/>
+          <w:iCs/>
+        </w:rPr>
+        <w:t>Enhancing player engagement through game balancing in digitally augmented physical games.</w:t>
+      </w:r>
+      <w:r>
+        <w:t xml:space="preserve"> </w:t>
+      </w:r>
+      <w:r>
+        <w:rPr>
+          <w:i/>
+          <w:iCs/>
+        </w:rPr>
+        <w:t>International Journal of Human-Computer Studies, 103</w:t>
+      </w:r>
+      <w:r>
+        <w:t xml:space="preserve">, 35–47. </w:t>
+      </w:r>
+      <w:hyperlink r:id="rId15">
+        <w:r>
+          <w:rPr>
+            <w:color w:val="1155CC"/>
+            <w:u w:val="single"/>
+          </w:rPr>
+          <w:t>https://doi.org/10.1016/j.ijhcs.2017.02.004</w:t>
+        </w:r>
+      </w:hyperlink>
+    </w:p>
+    <w:p/>
+    <w:p>
+      <w:proofErr w:type="gramStart"/>
+      <w:r>
+        <w:t>5.1)Irabor</w:t>
+      </w:r>
+      <w:proofErr w:type="gramEnd"/>
+      <w:r>
+        <w:t xml:space="preserve">, T.‑J., Yameogo, P. S. A., Perrin, L., &amp; </w:t>
+      </w:r>
+      <w:proofErr w:type="spellStart"/>
+      <w:r>
+        <w:t>Ruëgg</w:t>
+      </w:r>
+      <w:proofErr w:type="spellEnd"/>
+      <w:r>
+        <w:t xml:space="preserve">, S. R. (2025). </w:t>
+      </w:r>
+      <w:r>
+        <w:rPr>
+          <w:i/>
+          <w:iCs/>
+        </w:rPr>
+        <w:t>Gaming for change — exploring systems thinking and sustainable practices through complexity‑inspired game mechanics.</w:t>
+      </w:r>
+      <w:r>
+        <w:t xml:space="preserve"> </w:t>
+      </w:r>
+      <w:r>
+        <w:rPr>
+          <w:i/>
+          <w:iCs/>
+        </w:rPr>
+        <w:t>Humanities and Social Sciences Communications, 12</w:t>
+      </w:r>
+      <w:r>
+        <w:t xml:space="preserve">, Article 680. </w:t>
+      </w:r>
+      <w:hyperlink r:id="rId16">
+        <w:r>
+          <w:rPr>
+            <w:color w:val="1155CC"/>
+            <w:u w:val="single"/>
+          </w:rPr>
+          <w:t>https://www.nature.com/articles/s41599-025-04990-x?</w:t>
+        </w:r>
+      </w:hyperlink>
+    </w:p>
+    <w:p/>
+    <w:p>
+      <w:r>
+        <w:t xml:space="preserve">5.2) Irabor, T.‑J., Yameogo, P. S. A., Perrin, L., &amp; </w:t>
+      </w:r>
+      <w:proofErr w:type="spellStart"/>
+      <w:r>
+        <w:t>Ruëgg</w:t>
+      </w:r>
+      <w:proofErr w:type="spellEnd"/>
+      <w:r>
+        <w:t xml:space="preserve">, S. R. (2025). </w:t>
+      </w:r>
+      <w:r>
+        <w:rPr>
+          <w:i/>
+          <w:iCs/>
+        </w:rPr>
+        <w:t>Gaming for change — exploring systems thinking and sustainable practices through complexity‑inspired game mechanics.</w:t>
+      </w:r>
+      <w:r>
+        <w:t xml:space="preserve"> </w:t>
+      </w:r>
+      <w:r>
+        <w:rPr>
+          <w:i/>
+          <w:iCs/>
+        </w:rPr>
+        <w:t>Humanities and Social Sciences Communications, 12</w:t>
+      </w:r>
+      <w:r>
+        <w:t xml:space="preserve">, Article 680. </w:t>
+      </w:r>
+      <w:hyperlink r:id="rId17">
+        <w:r>
+          <w:rPr>
+            <w:color w:val="1155CC"/>
+            <w:u w:val="single"/>
+          </w:rPr>
+          <w:t>https://www.nature.com/articles/s41599-025-04990-x?</w:t>
+        </w:r>
+      </w:hyperlink>
+    </w:p>
+    <w:p/>
+    <w:p>
+      <w:proofErr w:type="gramStart"/>
+      <w:r>
+        <w:t>6.1)</w:t>
+      </w:r>
+      <w:r>
+        <w:rPr>
+          <w:b/>
+          <w:bCs/>
+        </w:rPr>
+        <w:t>Heron</w:t>
+      </w:r>
+      <w:proofErr w:type="gramEnd"/>
+      <w:r>
+        <w:rPr>
+          <w:b/>
+          <w:bCs/>
+        </w:rPr>
+        <w:t xml:space="preserve">, M. J., Belford, P. H., Reid, H., &amp; Crabb, M. (2018). </w:t>
+      </w:r>
+      <w:r>
+        <w:t>Eighteen months of Meeple Like Us: An exploration into the state of board game accessibility. Computer Games Journal, 7(2), 75–95.</w:t>
+      </w:r>
+    </w:p>
+    <w:p>
+      <w:pPr>
+        <w:rPr>
+          <w:color w:val="FFFFFF"/>
+          <w:sz w:val="20"/>
+          <w:szCs w:val="20"/>
+        </w:rPr>
+      </w:pPr>
+      <w:r>
+        <w:t xml:space="preserve"> </w:t>
+      </w:r>
+      <w:r>
+        <w:rPr>
+          <w:color w:val="FFFFFF"/>
+          <w:sz w:val="20"/>
+          <w:szCs w:val="20"/>
+        </w:rPr>
+        <w:t>​</w:t>
+      </w:r>
+    </w:p>
+    <w:p>
+      <w:pPr>
+        <w:rPr>
+          <w:sz w:val="44"/>
+          <w:szCs w:val="44"/>
+        </w:rPr>
+      </w:pPr>
     </w:p>
     <w:sectPr>
       <w:pgSz w:w="11909" w:h="16834"/>

</xml_diff>